<commit_message>
docs: add sampling date, coordinates and NCBI accessions
Sampling 29 March 2026; Chandubi Beel 25.881015 N 91.422898 E; Deepor Beel
26.10953 N 91.70818 E; BioProject PRJNA1551452 (BioSamples SAMN64467025,
SAMN64467026) in manuscript, BioSample sheet, page and README.

Co-Authored-By: Claude Opus 5.5 <noreply@anthropic.com>
</commit_message>
<xml_diff>
--- a/results/12_manuscript/Manuscript_EMAS.docx
+++ b/results/12_manuscript/Manuscript_EMAS.docx
@@ -264,7 +264,7 @@
           <w:sz w:val="20"/>
           <w:szCs w:val="20"/>
         </w:rPr>
-        <w:t xml:space="preserve">Surface water was collected at one near-shore location in each wetland: Deepor Beel (W2; [sampling coordinates]) and Chandubi Beel (W1; [sampling coordinates]), Kamrup district, Assam, India. The study was designed as a biological baseline and did not include water chemistry; the contrast between the wetlands is defined by their setting — Deepor Beel adjoining the municipal solid-waste dumping ground of Guwahati and Chandubi Beel without comparable pressure — and the trophic state of each is inferred from biological indicators (see below).</w:t>
+        <w:t xml:space="preserve">Surface water was collected on 29 March 2026 at one near-shore location in each wetland: Deepor Beel (W2; 26.10953° N, 91.70818° E) and Chandubi Beel (W1; 25.881015° N, 91.422898° E), Kamrup district, Assam, India. The study was designed as a biological baseline and did not include water chemistry; the contrast between the wetlands is defined by their setting — Deepor Beel adjoining the municipal solid-waste dumping ground of Guwahati and Chandubi Beel without comparable pressure — and the trophic state of each is inferred from biological indicators (see below).</w:t>
       </w:r>
     </w:p>
     <w:p>
@@ -7472,7 +7472,7 @@
           <w:sz w:val="20"/>
           <w:szCs w:val="20"/>
         </w:rPr>
-        <w:t xml:space="preserve">Raw sequence reads are deposited in the NCBI Sequence Read Archive under BioProject [accession]. ASV sequences, ASV and taxonomy tables, and all analysis scripts are available at https://github.com/Angsumi/Sahil_Metagenome.</w:t>
+        <w:t xml:space="preserve">Raw sequence reads are deposited in the NCBI Sequence Read Archive under BioProject PRJNA1551452 (BioSamples SAMN64467025 and SAMN64467026). ASV sequences, ASV and taxonomy tables, and all analysis scripts are available at https://github.com/Angsumi/Sahil_Metagenome.</w:t>
       </w:r>
     </w:p>
     <w:p>

</xml_diff>

<commit_message>
fix(manuscript): factual corrections and opening-section de-templating
- correct 'found only by microscopy' count (17, not 47): unquote empty TSV cells
- remove unsupported claims: 'dense macrophyte cover' (now hedged), 'largest city'
  (dropped), 'most abundant metazoan sequence' (now 'COI sequence')
- abstract/introduction: minimal edits to templated phrasing (closing claim made
  concrete from results, copula avoidance, aphoristic opener moved, 'Here we provide'
  aims template replaced with the design statement); citations and numbers unchanged
- remove remaining em dashes from body text

Co-Authored-By: Claude Opus 5.5 <noreply@anthropic.com>
</commit_message>
<xml_diff>
--- a/results/12_manuscript/Manuscript_EMAS.docx
+++ b/results/12_manuscript/Manuscript_EMAS.docx
@@ -86,7 +86,7 @@
           <w:sz w:val="20"/>
           <w:szCs w:val="20"/>
         </w:rPr>
-        <w:t xml:space="preserve">Floodplain wetlands of the Brahmaputra valley are under growing urban pressure, yet molecular baselines of their plankton are lacking. We characterised the plankton of Deepor Beel, a Ramsar wetland bordering the municipal solid-waste dumping ground of Guwahati, and the less disturbed Chandubi Beel using environmental DNA metabarcoding of two markers: the 18S rRNA V4 region for micro-eukaryotes and the mitochondrial cytochrome c oxidase I (COI) gene for metazoans. From 620,380 read pairs, joint denoising yielded 982 18S and 345 COI amplicon sequence variants. The micro-eukaryote communities were almost distinct (14.5% of variants shared): Chandubi Beel was dominated by green algae, diatoms and free-living protozoa, whereas Deepor Beel was richer (685 vs 436 variants) and dominated by fungi (24% of reads), oomycetes and desmids. In contrast, 77.1% of COI variants occurred in both wetlands, where rotifers formed 60–65% of reads. Protein-level searches placed 22 of the abundant unassigned COI variants among rotifers, revealing many rotifer lineages absent from reference libraries. The rotifer quotient QB/T of 5 in both wetlands and the enrichment of </w:t>
+        <w:t xml:space="preserve">Floodplain wetlands of the Brahmaputra valley are under growing urban pressure, yet molecular baselines of their plankton are lacking. We characterised the plankton of Deepor Beel, a Ramsar wetland bordering the municipal solid-waste dumping ground of Guwahati, and the less disturbed Chandubi Beel using environmental DNA metabarcoding of two markers: the 18S rRNA V4 region for micro-eukaryotes and the mitochondrial cytochrome c oxidase I (COI) gene for metazoans. From 620,380 read pairs, joint denoising yielded 982 18S and 345 COI amplicon sequence variants. The micro-eukaryote communities were almost distinct (14.5% of variants shared): Chandubi Beel was dominated by green algae, diatoms and free-living protozoa, whereas Deepor Beel was richer (685 vs 436 variants) and dominated by fungi (24% of reads), oomycetes and desmids. In contrast, 77.1% of COI variants occurred in both wetlands, where rotifers formed 60–65% of reads. When the abundant unassigned COI variants were compared at protein level, 22 of them grouped with rotifers, so many rotifer lineages in these wetlands are absent from reference libraries. The rotifer quotient QB/T of 5 in both wetlands and the enrichment of </w:t>
       </w:r>
       <w:r>
         <w:rPr>
@@ -122,7 +122,7 @@
           <w:sz w:val="20"/>
           <w:szCs w:val="20"/>
         </w:rPr>
-        <w:t xml:space="preserve"> at Deepor Beel indicate nutrient-rich conditions. DNA detections agreed with published microscopy for the dominant desmid and rotifer genera. These results provide the first molecular plankton baseline for both wetlands and show that combining markers is essential for wetland biomonitoring in north-eastern India.</w:t>
+        <w:t xml:space="preserve"> at Deepor Beel indicate nutrient-rich conditions. DNA detections agreed with published microscopy for the dominant desmid and rotifer genera. This is the first molecular plankton baseline for either wetland, and most named animal genera were detected by only one of the two markers, which argues for combining markers in wetland biomonitoring in north-eastern India.</w:t>
       </w:r>
     </w:p>
     <w:p>
@@ -176,7 +176,7 @@
           <w:sz w:val="20"/>
           <w:szCs w:val="20"/>
         </w:rPr>
-        <w:t xml:space="preserve">Wetland plankton respond within weeks to changes in nutrient load, organic matter and hydrology, which makes them sensitive indicators of ecological condition. Identifying them by microscopy is, however, slow and demands separate expertise for rotifers, crustaceans, protists and algae, while small and fragile forms are routinely overlooked. Environmental DNA (eDNA) metabarcoding offers a complementary route: DNA shed into the water is amplified with taxonomically informative markers and sequenced in a single assay, and its use for monitoring Indian fresh waters is growing (Sahu et al., 2025).</w:t>
+        <w:t xml:space="preserve">Wetland plankton respond within weeks to changes in nutrient load, organic matter and hydrology, which makes them sensitive indicators of ecological condition. Identifying them by microscopy is, however, slow and demands separate expertise for rotifers, crustaceans, protists and algae, while small and fragile forms are routinely overlooked. Environmental DNA (eDNA) metabarcoding is a complementary approach. DNA that organisms shed into the water is amplified with taxonomically informative markers and sequenced in a single assay, and its use for monitoring Indian fresh waters is growing (Sahu et al., 2025).</w:t>
       </w:r>
     </w:p>
     <w:p>
@@ -190,7 +190,7 @@
           <w:sz w:val="20"/>
           <w:szCs w:val="20"/>
         </w:rPr>
-        <w:t xml:space="preserve">No single marker recovers a whole plankton community. Mitochondrial cytochrome c oxidase I (COI) resolves metazoan zooplankton to species where reference sequences exist, whereas the nuclear 18S rRNA gene captures the broader eukaryotic assemblage — algae, protists and fungi — usually at coarser taxonomic ranks. Studies that combine markers consistently detect more taxa than either marker alone (Zhang et al., 2018; Stefanni et al., 2018; Sildever et al., 2021; Zhao et al., 2021), and eDNA surveys have linked shifts in plankton composition to anthropogenic pressure in lakes and reservoirs (Lin et al., 2023; Jo et al., 2026). The reliability of species-level assignments nevertheless depends on reference databases, which remain incomplete for tropical freshwater invertebrates (Chen et al., 2025).</w:t>
+        <w:t xml:space="preserve">Mitochondrial cytochrome c oxidase I (COI) resolves metazoan zooplankton to species where reference sequences exist, whereas the nuclear 18S rRNA gene captures the broader eukaryotic assemblage (algae, protists and fungi), usually at coarser taxonomic ranks. No single marker, then, recovers a whole plankton community on its own. Studies that combine markers consistently detect more taxa than either marker alone (Zhang et al., 2018; Stefanni et al., 2018; Sildever et al., 2021; Zhao et al., 2021), and eDNA surveys have linked shifts in plankton composition to anthropogenic pressure in lakes and reservoirs (Lin et al., 2023; Jo et al., 2026). The reliability of species-level assignments nevertheless depends on reference databases, which remain incomplete for tropical freshwater invertebrates (Chen et al., 2025).</w:t>
       </w:r>
     </w:p>
     <w:p>
@@ -204,7 +204,7 @@
           <w:sz w:val="20"/>
           <w:szCs w:val="20"/>
         </w:rPr>
-        <w:t xml:space="preserve">Deepor Beel is a Ramsar-listed floodplain wetland of the Brahmaputra on the south-western edge of Guwahati, the largest city of north-eastern India. It lies immediately beside the city's municipal solid-waste dumping ground, which exposes it to leachate and organic enrichment in addition to urban encroachment. Chandubi Beel, a natural lake in the same district, is comparatively undisturbed. The rotifers and algae of Deepor Beel have been described by microscopy (Sharma, 2010; Baruah et al., 2020), but no molecular survey exists for either wetland.</w:t>
+        <w:t xml:space="preserve">Deepor Beel is a Ramsar-listed floodplain wetland of the Brahmaputra on the south-western edge of Guwahati city. It lies immediately beside the city's municipal solid-waste dumping ground, which exposes it to leachate and organic enrichment in addition to urban encroachment. Chandubi Beel, a natural lake in the same district, is comparatively undisturbed. The rotifers and algae of Deepor Beel have been described by microscopy (Sharma, 2010; Baruah et al., 2020), but no molecular survey exists for either wetland.</w:t>
       </w:r>
     </w:p>
     <w:p>
@@ -218,7 +218,7 @@
           <w:sz w:val="20"/>
           <w:szCs w:val="20"/>
         </w:rPr>
-        <w:t xml:space="preserve">Here we provide a multi-marker eDNA baseline for the plankton of both wetlands. We asked (i) how the micro-eukaryote and metazoan communities of the pressured and the reference wetland differ, (ii) what biological indicators reveal about their trophic state in the absence of chemical monitoring, (iii) how much of the community can be named with current reference libraries, and (iv) whether DNA detections agree with earlier microscopy.</w:t>
+        <w:t xml:space="preserve">We sampled each wetland once and sequenced two markers, which supports a baseline description of the plankton rather than a test of differences. Four questions guided the analysis: (i) how the micro-eukaryote and metazoan communities of the pressured and the reference wetland differ, (ii) what biological indicators reveal about their trophic state in the absence of chemical monitoring, (iii) how much of the community can be named with current reference libraries, and (iv) whether DNA detections agree with earlier microscopy.</w:t>
       </w:r>
     </w:p>
     <w:p>
@@ -264,7 +264,7 @@
           <w:sz w:val="20"/>
           <w:szCs w:val="20"/>
         </w:rPr>
-        <w:t xml:space="preserve">Surface water was collected on 29 March 2026 at one near-shore location in each wetland: Deepor Beel (W2; 26.10953° N, 91.70818° E) and Chandubi Beel (W1; 25.881015° N, 91.422898° E), Kamrup district, Assam, India. The study was designed as a biological baseline and did not include water chemistry; the contrast between the wetlands is defined by their setting — Deepor Beel adjoining the municipal solid-waste dumping ground of Guwahati and Chandubi Beel without comparable pressure — and the trophic state of each is inferred from biological indicators (see below).</w:t>
+        <w:t xml:space="preserve">Surface water was collected on 29 March 2026 at one near-shore location in each wetland: Deepor Beel (W2; 26.10953° N, 91.70818° E) and Chandubi Beel (W1; 25.881015° N, 91.422898° E), Kamrup district, Assam, India. The study was designed as a biological baseline and did not include water chemistry; the contrast between the wetlands is defined by their setting (Deepor Beel adjoining the municipal solid-waste dumping ground of Guwahati, and Chandubi Beel without comparable pressure), and the trophic state of each is inferred from biological indicators (see below).</w:t>
       </w:r>
     </w:p>
     <w:p>
@@ -4249,7 +4249,7 @@
           <w:sz w:val="20"/>
           <w:szCs w:val="20"/>
         </w:rPr>
-        <w:t xml:space="preserve"> (1.1% vs 2.4%) were more abundant in Deepor Beel, in line with organic enrichment from the adjacent dumping ground. Chandubi Beel nevertheless carried diatoms typical of enriched water — </w:t>
+        <w:t xml:space="preserve"> (1.1% vs 2.4%) were more abundant in Deepor Beel, in line with organic enrichment from the adjacent dumping ground. Chandubi Beel nevertheless carried diatoms typical of enriched water, namely </w:t>
       </w:r>
       <w:r>
         <w:rPr>
@@ -4303,7 +4303,7 @@
           <w:sz w:val="20"/>
           <w:szCs w:val="20"/>
         </w:rPr>
-        <w:t xml:space="preserve"> — indicating that it too is nutrient-rich rather than pristine. The prominence of desmids in Deepor Beel reflects its dense macrophyte cover, a habitat in which desmids thrive.</w:t>
+        <w:t xml:space="preserve">, which indicates that it too is nutrient-rich rather than pristine. The prominence of desmids in Deepor Beel may reflect the macrophyte-rich habitat of this wetland, in which desmids commonly occur.</w:t>
       </w:r>
     </w:p>
     <w:p>
@@ -7119,7 +7119,7 @@
           <w:sz w:val="20"/>
           <w:szCs w:val="20"/>
         </w:rPr>
-        <w:t xml:space="preserve">, and DNA added 23 genera not listed. Of the genera found only by microscopy, 47 were cyanobacteria, which lack an 18S gene, or euglenoids, which are poorly amplified by V4 primers. For rotifers, DNA detected 4 of the five quantitatively important genera and 6 of the seven important families reported by Sharma (2010), but only 2 of the seven important species, again reflecting the reference-library gap rather than absence.</w:t>
+        <w:t xml:space="preserve">, and DNA added 23 genera not listed. Of the genera found only by microscopy, 17 were cyanobacteria, which lack an 18S gene, or euglenoids, which are poorly amplified by V4 primers. For rotifers, DNA detected 4 of the five quantitatively important genera and 6 of the seven important families reported by Sharma (2010), but only 2 of the seven important species, again reflecting the reference-library gap rather than absence.</w:t>
       </w:r>
     </w:p>
     <w:p>
@@ -7352,7 +7352,7 @@
           <w:sz w:val="20"/>
           <w:szCs w:val="20"/>
         </w:rPr>
-        <w:t xml:space="preserve">This first molecular plankton baseline for Deepor Beel and Chandubi Beel shows two wetlands that share their rotifer zooplankton but differ sharply in their micro-eukaryote communities. Deepor Beel, beside the city's solid-waste dumping ground, carries a richer community dominated by fungi, oomycetes, desmids and decomposers, and a stronger signal of eutrophy-associated rotifers, while Chandubi Beel is dominated by green algae, diatoms and protozoa. Rotifer indicators point to nutrient-rich conditions in both wetlands. Many rotifer lineages and the most abundant metazoan sequence lack reference sequences, which identifies barcoding of the regional fauna as a priority. Combining 18S and COI markers, and checking detections against microscopy, provides a practical framework for monitoring these wetlands.</w:t>
+        <w:t xml:space="preserve">This first molecular plankton baseline for Deepor Beel and Chandubi Beel shows two wetlands that share their rotifer zooplankton but differ sharply in their micro-eukaryote communities. Deepor Beel, beside the city's solid-waste dumping ground, carries a richer community dominated by fungi, oomycetes, desmids and decomposers, and a stronger signal of eutrophy-associated rotifers, while Chandubi Beel is dominated by green algae, diatoms and protozoa. Rotifer indicators point to nutrient-rich conditions in both wetlands. Many rotifer lineages and the most abundant COI sequence lack reference sequences, which identifies barcoding of the regional fauna as a priority. Combining 18S and COI markers, and checking detections against microscopy, provides a practical framework for monitoring these wetlands.</w:t>
       </w:r>
     </w:p>
     <w:p>

</xml_diff>

<commit_message>
fix(manuscript): de-template results/discussion and conclusions
Minimal edits to recurring '...indicating that / these results show / provides a
framework' endings; marker-complementarity claim made concrete from existing counts
(COI alone misses 14 of 20 genera, 18S alone 5); dumping-ground interpretation
bounded by 'organic loading was not measured'. Numbers, citations and hedges
unchanged; Methods left as is (protected technical content).

Co-Authored-By: Claude Opus 5.5 <noreply@anthropic.com>
</commit_message>
<xml_diff>
--- a/results/12_manuscript/Manuscript_EMAS.docx
+++ b/results/12_manuscript/Manuscript_EMAS.docx
@@ -466,7 +466,7 @@
           <w:sz w:val="20"/>
           <w:szCs w:val="20"/>
         </w:rPr>
-        <w:t xml:space="preserve">Sequencing produced 620,380 read pairs, of which 87.8–89.6% carried both primers (Table 1). After denoising, merging, chimera removal (9.3% of 18S and 3.8% of COI reads) and curation, 53.3–57.2% (18S) and 69.7–71.7% (COI) of raw pairs were retained. Curation removed few reads (COI: 31 ASVs, 0.4% of reads; 18S: 53 ASVs, 2.6%), and the retained COI ASVs clustered at 313 and 316 bp, as expected for a protein-coding fragment. Rarefaction curves reached a plateau for both markers in both wetlands (Fig. 1), indicating that sequencing depth was sufficient.</w:t>
+        <w:t xml:space="preserve">Sequencing produced 620,380 read pairs, of which 87.8–89.6% carried both primers (Table 1). After denoising, merging, chimera removal (9.3% of 18S and 3.8% of COI reads) and curation, 53.3–57.2% (18S) and 69.7–71.7% (COI) of raw pairs were retained. Curation removed few reads (COI: 31 ASVs, 0.4% of reads; 18S: 53 ASVs, 2.6%), and the retained COI ASVs clustered at 313 and 316 bp, as expected for a protein-coding fragment. For both markers in both wetlands the rarefaction curves levelled off (Fig. 1), so further sequencing of these libraries would have added few new ASVs.</w:t>
       </w:r>
     </w:p>
     <w:p>
@@ -2030,7 +2030,7 @@
           <w:sz w:val="20"/>
           <w:szCs w:val="20"/>
         </w:rPr>
-        <w:t xml:space="preserve"> (Fig. 2), together accounting for 29% and 25% of COI reads. The single most abundant COI variant (15–19% of reads in both wetlands) translated cleanly but was at most 72% identical to any GenBank sequence, and its protein fell between a nematode (86%) and stramenopile algae, so its identity remains unresolved. These results show that the gap lies in the reference libraries rather than in the data: north-eastern Indian rotifers are poorly represented, consistent with the limitations noted for freshwater invertebrates generally (Chen et al., 2025).</w:t>
+        <w:t xml:space="preserve"> (Fig. 2), together accounting for 29% and 25% of COI reads. The single most abundant COI variant (15–19% of reads in both wetlands) translated cleanly but was at most 72% identical to any GenBank sequence, and its protein fell between a nematode (86%) and stramenopile algae, so its identity remains unresolved. The gap therefore lies in the reference libraries rather than in the data. North-eastern Indian rotifers are poorly represented in them, which is consistent with the limitations noted for freshwater invertebrates generally (Chen et al., 2025).</w:t>
       </w:r>
     </w:p>
     <w:p>
@@ -2363,7 +2363,7 @@
           <w:sz w:val="20"/>
           <w:szCs w:val="20"/>
         </w:rPr>
-        <w:t xml:space="preserve"> (Fig. 4). A micro-eukaryote community weighted towards decomposers and parasites is consistent with the organic input expected beside a solid-waste dumping ground.</w:t>
+        <w:t xml:space="preserve"> (Fig. 4). Such a weighting towards decomposers and parasites is consistent with the organic input expected beside a solid-waste dumping ground, although organic loading itself was not measured in this study.</w:t>
       </w:r>
     </w:p>
     <w:p>
@@ -2685,7 +2685,7 @@
           <w:sz w:val="20"/>
           <w:szCs w:val="20"/>
         </w:rPr>
-        <w:t xml:space="preserve">Overlap differed even more (Fig. 5b). Only 14.5% of 18S ASVs and 24.5% of named 18S genera occurred in both wetlands (Bray–Curtis dissimilarity 0.95), whereas 77.1% of COI ASVs were shared at similar relative abundance (Bray–Curtis 0.23). The wetlands therefore share largely the same rotifer assemblage while hosting distinct algal, protist and fungal communities. A shared rotifer pool is plausible for floodplain lakes of the same river system, as rotifers disperse readily through resting eggs and seasonal hydrological connection, whereas micro-eukaryote producers and decomposers respond more directly to local conditions such as organic loading and macrophyte cover.</w:t>
+        <w:t xml:space="preserve">Overlap differed even more (Fig. 5b). Only 14.5% of 18S ASVs and 24.5% of named 18S genera occurred in both wetlands (Bray–Curtis dissimilarity 0.95), whereas 77.1% of COI ASVs were shared at similar relative abundance (Bray–Curtis 0.23). In other words, largely the same rotifer assemblage occurs in both wetlands, but their algal, protist and fungal communities are mostly distinct. A shared rotifer pool is plausible for floodplain lakes of the same river system, as rotifers disperse readily through resting eggs and seasonal hydrological connection, whereas micro-eukaryote producers and decomposers respond more directly to local conditions such as organic loading and macrophyte cover.</w:t>
       </w:r>
     </w:p>
     <w:p>
@@ -4159,7 +4159,7 @@
           <w:sz w:val="20"/>
           <w:szCs w:val="20"/>
         </w:rPr>
-        <w:t xml:space="preserve">Without chemical data, the trophic condition of the wetlands can be read from indicator taxa (Table 3). The rotifer quotient QB/T was 5 in both wetlands (10 </w:t>
+        <w:t xml:space="preserve">Because no chemical data were collected, we read the trophic condition of the two wetlands from indicator taxa (Table 3). The rotifer quotient QB/T was 5 in both wetlands (10 </w:t>
       </w:r>
       <w:r>
         <w:rPr>
@@ -7119,7 +7119,7 @@
           <w:sz w:val="20"/>
           <w:szCs w:val="20"/>
         </w:rPr>
-        <w:t xml:space="preserve">, and DNA added 23 genera not listed. Of the genera found only by microscopy, 17 were cyanobacteria, which lack an 18S gene, or euglenoids, which are poorly amplified by V4 primers. For rotifers, DNA detected 4 of the five quantitatively important genera and 6 of the seven important families reported by Sharma (2010), but only 2 of the seven important species, again reflecting the reference-library gap rather than absence.</w:t>
+        <w:t xml:space="preserve">, and DNA added 23 genera not listed. Of the genera found only by microscopy, 17 were cyanobacteria, which lack an 18S gene, or euglenoids, which are poorly amplified by V4 primers. For rotifers, DNA detected 4 of the five quantitatively important genera and 6 of the seven important families reported by Sharma (2010), but only 2 of the seven important species, a shortfall that again points to the reference-library gap rather than to the absence of these species.</w:t>
       </w:r>
     </w:p>
     <w:p>
@@ -7308,7 +7308,7 @@
           <w:sz w:val="20"/>
           <w:szCs w:val="20"/>
         </w:rPr>
-        <w:t xml:space="preserve">) and 1 by both. Neither marker alone would have described these wetlands adequately, supporting multi-marker designs for wetland monitoring (Zhang et al., 2018; Stefanni et al., 2018; Zhao et al., 2021). Adding a phytoplankton-specific marker such as chloroplast 16S would further resolve the algal and cyanobacterial fraction (Lemonnier et al., 2025).</w:t>
+        <w:t xml:space="preserve">) and 1 by both. Relying on COI alone would have missed 14 of these 20 genera, and relying on 18S alone would have missed 5, which supports multi-marker designs for wetland monitoring (Zhang et al., 2018; Stefanni et al., 2018; Zhao et al., 2021). Adding a phytoplankton-specific marker such as chloroplast 16S would further resolve the algal and cyanobacterial fraction (Lemonnier et al., 2025).</w:t>
       </w:r>
     </w:p>
     <w:p>
@@ -7352,7 +7352,7 @@
           <w:sz w:val="20"/>
           <w:szCs w:val="20"/>
         </w:rPr>
-        <w:t xml:space="preserve">This first molecular plankton baseline for Deepor Beel and Chandubi Beel shows two wetlands that share their rotifer zooplankton but differ sharply in their micro-eukaryote communities. Deepor Beel, beside the city's solid-waste dumping ground, carries a richer community dominated by fungi, oomycetes, desmids and decomposers, and a stronger signal of eutrophy-associated rotifers, while Chandubi Beel is dominated by green algae, diatoms and protozoa. Rotifer indicators point to nutrient-rich conditions in both wetlands. Many rotifer lineages and the most abundant COI sequence lack reference sequences, which identifies barcoding of the regional fauna as a priority. Combining 18S and COI markers, and checking detections against microscopy, provides a practical framework for monitoring these wetlands.</w:t>
+        <w:t xml:space="preserve">According to this first molecular plankton baseline for Deepor Beel and Chandubi Beel, the two wetlands share their rotifer zooplankton but differ sharply in their micro-eukaryote communities. Deepor Beel, beside the city's solid-waste dumping ground, carries a richer community dominated by fungi, oomycetes, desmids and decomposers, and a stronger signal of eutrophy-associated rotifers, while Chandubi Beel is dominated by green algae, diatoms and protozoa. Rotifer indicators point to nutrient-rich conditions in both wetlands. Many rotifer lineages and the most abundant COI sequence lack reference sequences, so barcoding the regional fauna should be treated as a priority. For future monitoring of these wetlands, pairing 18S with COI and checking DNA detections against microscopy, as done here, is a practical approach.</w:t>
       </w:r>
     </w:p>
     <w:p>

</xml_diff>